<commit_message>
Portfolio: old published structure (banner cover, title-only pages, prose responsibilities, 4-image rows), all 16 projects with typo fixes, real screenshots from the 2025-09 PDF
</commit_message>
<xml_diff>
--- a/templates/portfolio-classic/template.docx
+++ b/templates/portfolio-classic/template.docx
@@ -4,8 +4,11 @@
   <w:body>
     <w:p>
       <w:pPr>
+        <w:pBdr>
+          <w:bottom w:val="single" w:sz="6" w:space="2" w:color="FFFFFF"/>
+        </w:pBdr>
         <w:shd w:val="clear" w:color="auto" w:fill="F46B75"/>
-        <w:spacing w:before="240" w:after="0"/>
+        <w:spacing w:before="60" w:after="0"/>
         <w:jc w:val="center"/>
       </w:pPr>
       <w:r>
@@ -22,7 +25,7 @@
     <w:p>
       <w:pPr>
         <w:shd w:val="clear" w:color="auto" w:fill="F46B75"/>
-        <w:spacing w:before="0" w:after="0"/>
+        <w:spacing w:before="80" w:after="200"/>
         <w:jc w:val="center"/>
       </w:pPr>
       <w:r>
@@ -38,16 +41,20 @@
     </w:p>
     <w:p>
       <w:pPr>
+        <w:pBdr>
+          <w:bottom w:val="single" w:sz="6" w:space="4" w:color="FFFFFF"/>
+        </w:pBdr>
         <w:shd w:val="clear" w:color="auto" w:fill="F46B75"/>
-        <w:spacing w:before="120" w:after="120"/>
-        <w:jc w:val="center"/>
+        <w:spacing w:before="160" w:after="100"/>
+        <w:jc w:val="left"/>
       </w:pPr>
       <w:r>
         <w:rPr>
           <w:rFonts w:ascii="DIN Condensed" w:hAnsi="DIN Condensed" w:cs="DIN Condensed"/>
+          <w:caps/>
           <w:color w:val="FFFFFF"/>
-          <w:sz w:val="28"/>
-          <w:szCs w:val="28"/>
+          <w:sz w:val="24"/>
+          <w:szCs w:val="24"/>
         </w:rPr>
         <w:t xml:space="preserve">{{cover_contact}}</w:t>
       </w:r>

</xml_diff>

<commit_message>
Portfolio cover: empty banner row above the links so they aren't clipped at the page top
</commit_message>
<xml_diff>
--- a/templates/portfolio-classic/template.docx
+++ b/templates/portfolio-classic/template.docx
@@ -2,6 +2,21 @@
 <file path=word/document.xml><?xml version="1.0" encoding="utf-8"?>
 <w:document xmlns:w="http://schemas.openxmlformats.org/wordprocessingml/2006/main" xmlns:r="http://schemas.openxmlformats.org/officeDocument/2006/relationships" xmlns:wp="http://schemas.openxmlformats.org/drawingml/2006/wordprocessingDrawing" xmlns:a="http://schemas.openxmlformats.org/drawingml/2006/main" xmlns:pic="http://schemas.openxmlformats.org/drawingml/2006/picture">
   <w:body>
+    <w:p>
+      <w:pPr>
+        <w:shd w:val="clear" w:color="auto" w:fill="F46B75"/>
+        <w:spacing w:before="0" w:after="0"/>
+        <w:jc w:val="left"/>
+      </w:pPr>
+      <w:r>
+        <w:rPr>
+          <w:rFonts w:ascii="DIN Condensed" w:hAnsi="DIN Condensed" w:cs="DIN Condensed"/>
+          <w:sz w:val="20"/>
+          <w:szCs w:val="20"/>
+        </w:rPr>
+        <w:t xml:space="preserve">{{cover_top}}</w:t>
+      </w:r>
+    </w:p>
     <w:p>
       <w:pPr>
         <w:pBdr>

</xml_diff>